<commit_message>
Load/wash buffer of LOT-BUF-2287 is acetate (owner, 2026-10-11): lot record and DEV-007-01 corrected; PD-007-12 records that Version 1.0 of PCR-007 named it Tris in error; PCR-007 cites it, annex re-anchored (1,651 quotes grounded); QA set rebuilt
Co-Authored-By: Claude Opus 5.5 <noreply@anthropic.com>
</commit_message>
<xml_diff>
--- a/pc_package/PCR-007_cex.docx
+++ b/pc_package/PCR-007_cex.docx
@@ -2194,7 +2194,7 @@
         <w:pStyle w:val="BodyText"/>
       </w:pPr>
       <w:r>
-        <w:t xml:space="preserve">Version 1.0 recorded 2 events of execution, which this report keeps as study events under their Version 1.0 DEV numbers. Screening run 6 used a load/wash buffer from an expired lot (DEV-007-01), and the column inlet temperature rose above its set-point during response-surface run 14 (DEV-007-02). Both runs were retained in the analysis. The register records 11 discrepancies from the plan. Four concern the analysis and the scale-down model. They are the model selection, conclusions that rest on a model that does not meet the criterion on residuals, the flow-rate study without its set-point run, and the residual DNA offset, which was recorded and not investigated. Five concern records the plan required that are not in the study record. These are the load results for aggregate and host cell protein, residual DNA and leached Protein A on the screening runs, the flow-through, wash and strip fractions with the mass balance, the packing tests of each campaign, and the feed lots. The other two are the fractionated runs of S-CEX-FRC, which no version of the plan foresaw, and the approaches this report takes where the plan sets no threshold, with capability given for the drug substance and not for the step.</w:t>
+        <w:t xml:space="preserve">Version 1.0 recorded 2 events of execution, which this report keeps as study events under their Version 1.0 DEV numbers. Screening run 6 used a load/wash buffer from an expired lot (DEV-007-01), and the column inlet temperature rose above its set-point during response-surface run 14 (DEV-007-02). Both runs were retained in the analysis. The register records 12 discrepancies from the plan. Four concern the analysis and the scale-down model. They are the model selection, conclusions that rest on a model that does not meet the criterion on residuals, the flow-rate study without its set-point run, and the residual DNA offset, which was recorded and not investigated. Five concern records the plan required that are not in the study record. These are the load results for aggregate and host cell protein, residual DNA and leached Protein A on the screening runs, the flow-through, wash and strip fractions with the mass balance, the packing tests of each campaign, and the feed lots. The other two are the fractionated runs of S-CEX-FRC, which no version of the plan foresaw, and the approaches this report takes where the plan sets no threshold, with capability given for the drug substance and not for the step. The last corrects an error of Version 1.0 of this report, which named the acetate load/wash buffer of screening run 6 a Tris buffer.</w:t>
       </w:r>
     </w:p>
     <w:bookmarkEnd w:id="23"/>
@@ -3710,7 +3710,7 @@
         </w:r>
       </w:hyperlink>
       <w:r>
-        <w:t xml:space="preserve">). Version 1.0 of this report stated that the load, the flow-through and the wash of each run were assayed and that the column was released against SOP-2008. No result of those assays or of that release is in the record, and Version 2.0 records each gap as a discrepancy.</w:t>
+        <w:t xml:space="preserve">). Version 1.0 of this report stated that the load, the flow-through and the wash of each run were assayed and that the column was released against SOP-2008. No result of those assays or of that release is in the record, and Version 2.0 records each gap as a discrepancy. Version 1.0 of this report also named the load/wash buffer of screening run 6 a Tris buffer. It was an acetate buffer (discrepancy PD-007-12).</w:t>
       </w:r>
     </w:p>
     <w:tbl>
@@ -24145,7 +24145,7 @@
         <w:pStyle w:val="BodyText"/>
       </w:pPr>
       <w:r>
-        <w:t xml:space="preserve">The discrepancies from the plan fall into three groups. The analysis departs from the plan in the model selection, in the use of a host cell protein model that does not meet the residual criterion, and in the approaches taken where the plan sets no threshold. The selection changed the terms of the models but no conclusion over the NOR. The run-order drift of the host cell protein residuals, a factor of 1.13 over the study, would raise the highest single-run limit over the NOR to 326 ng/mg, below the criterion of 418 ng/mg. The execution departs from the plan in the flow-rate study without its set-point run, the residual DNA offset recorded without investigation, and the fractionated runs of S-CEX-FRC. The record lacks the load results, the residual DNA and leached Protein A results of the screening runs, the fractions and the mass balance, the packing tests of each campaign and the feed lots. The missing load results matter most, because every clearance factor of aggregate and host cell protein rests on the process model at set-point instead of a measured load.</w:t>
+        <w:t xml:space="preserve">The discrepancies from the plan fall into three groups. The analysis departs from the plan in the model selection, in the use of a host cell protein model that does not meet the residual criterion, and in the approaches taken where the plan sets no threshold. The selection changed the terms of the models but no conclusion over the NOR. The run-order drift of the host cell protein residuals, a factor of 1.13 over the study, would raise the highest single-run limit over the NOR to 326 ng/mg, below the criterion of 418 ng/mg. The execution departs from the plan in the flow-rate study without its set-point run, the residual DNA offset recorded without investigation, and the fractionated runs of S-CEX-FRC. The record lacks the load results, the residual DNA and leached Protein A results of the screening runs, the fractions and the mass balance, the packing tests of each campaign and the feed lots. The missing load results matter most, because every clearance factor of aggregate and host cell protein rests on the process model at set-point instead of a measured load. Apart from these groups, discrepancy PD-007-12 corrects the name of the load/wash buffer of screening run 6 and changes no result.</w:t>
       </w:r>
     </w:p>
     <w:p>
@@ -24307,11 +24307,11 @@
         </w:numPr>
       </w:pPr>
       <w:r>
-        <w:t xml:space="preserve">The runs of both study events were retained. Without screening run 6, made with the expired buffer lot, the screening models find the same significant terms. Without response-surface run 14, made during the temperature excursion, the judgement over the NOR, the design space and the outcome of the verification are unchanged, while the selected models of aggregate and yield change terms. The register records 11 discrepancies from the plan.</w:t>
+        <w:t xml:space="preserve">The runs of both study events were retained. Without screening run 6, made with the expired buffer lot, the screening models find the same significant terms. Without response-surface run 14, made during the temperature excursion, the judgement over the NOR, the design space and the outcome of the verification are unchanged, while the selected models of aggregate and yield change terms. The register records 12 discrepancies from the plan.</w:t>
       </w:r>
     </w:p>
     <w:bookmarkEnd w:id="127"/>
-    <w:bookmarkStart w:id="145" w:name="sec-record"/>
+    <w:bookmarkStart w:id="146" w:name="sec-record"/>
     <w:p>
       <w:pPr>
         <w:pStyle w:val="Heading1"/>
@@ -24465,7 +24465,7 @@
                     <w:jc w:val="center"/>
                   </w:pPr>
                   <w:r>
-                    <w:t xml:space="preserve">Expired Tris load/wash buffer lot used in screening run 6</w:t>
+                    <w:t xml:space="preserve">Expired acetate load/wash buffer lot used in screening run 6</w:t>
                   </w:r>
                 </w:p>
               </w:tc>
@@ -24570,7 +24570,7 @@
         <w:pStyle w:val="FirstParagraph"/>
       </w:pPr>
       <w:r>
-        <w:t xml:space="preserve">The load/wash buffer used in screening run 6 came from lot LOT-BUF-2287, which had expired on 2026-02-11, before the screening study started on 2026-02-16. The expiry was found in the documentation review after the study. The record gives the cause as an expiry date not checked at preparation. A lot that is within its expiry date when it is prepared can still be expired when it is used, so the check that would have found this lot is a check at the time of use. Under SOP-2103 (Buffer Preparation, Release and Expiry Control), which authorises a re-test of the retained sample for an expired lot, the retained sample was re-tested and gave pH 5.02 and a conductivity of 5.06 mS/cm. The record gives no acceptance range for these values, so this report does not judge the lot from them.</w:t>
+        <w:t xml:space="preserve">The load/wash buffer used in screening run 6 came from lot LOT-BUF-2287, which had expired on 2026-02-11, before the screening study started on 2026-02-16. The lot is an acetate load/wash buffer, and Version 1.0 of this report named it a Tris buffer in error (discrepancy PD-007-12). The expiry was found in the documentation review after the study. The record gives the cause as an expiry date not checked at preparation. A lot that is within its expiry date when it is prepared can still be expired when it is used, so the check that would have found this lot is a check at the time of use. Under SOP-2103 (Buffer Preparation, Release and Expiry Control), which authorises a re-test of the retained sample for an expired lot, the retained sample was re-tested and gave pH 5.02 and a conductivity of 5.06 mS/cm. That pH lies in the buffering range of acetate. The record gives no acceptance range for these values, so this report does not judge the lot from them.</w:t>
       </w:r>
     </w:p>
     <w:p>
@@ -24620,7 +24620,7 @@
     </w:p>
     <w:bookmarkEnd w:id="130"/>
     <w:bookmarkEnd w:id="131"/>
-    <w:bookmarkStart w:id="144" w:name="sec-discrepancies"/>
+    <w:bookmarkStart w:id="145" w:name="sec-discrepancies"/>
     <w:p>
       <w:pPr>
         <w:pStyle w:val="Heading2"/>
@@ -25496,6 +25496,73 @@
                 </w:p>
               </w:tc>
             </w:tr>
+            <w:tr>
+              <w:tc>
+                <w:tcPr/>
+                <w:p>
+                  <w:pPr>
+                    <w:pStyle w:val="Compact"/>
+                    <w:jc w:val="left"/>
+                    <w:jc w:val="center"/>
+                  </w:pPr>
+                  <w:r>
+                    <w:t xml:space="preserve">PD-007-12</w:t>
+                  </w:r>
+                </w:p>
+              </w:tc>
+              <w:tc>
+                <w:tcPr/>
+                <w:p>
+                  <w:pPr>
+                    <w:pStyle w:val="Compact"/>
+                    <w:jc w:val="left"/>
+                    <w:jc w:val="center"/>
+                  </w:pPr>
+                  <w:r>
+                    <w:t xml:space="preserve">Load/wash buffer named Tris in Version 1.0 of the report</w:t>
+                  </w:r>
+                </w:p>
+              </w:tc>
+              <w:tc>
+                <w:tcPr/>
+                <w:p>
+                  <w:pPr>
+                    <w:pStyle w:val="Compact"/>
+                    <w:jc w:val="left"/>
+                    <w:jc w:val="center"/>
+                  </w:pPr>
+                  <w:r>
+                    <w:t xml:space="preserve">PCP-007: the materials of each run, the load/wash buffer among them, reported as the buffer record names them</w:t>
+                  </w:r>
+                </w:p>
+              </w:tc>
+              <w:tc>
+                <w:tcPr/>
+                <w:p>
+                  <w:pPr>
+                    <w:pStyle w:val="Compact"/>
+                    <w:jc w:val="left"/>
+                    <w:jc w:val="center"/>
+                  </w:pPr>
+                  <w:r>
+                    <w:t xml:space="preserve">the acetate load/wash buffer was used (lot LOT-BUF-2287 in screening run 6, study event DEV-007-01); Version 1.0 of this report named it a Tris buffer in error, and its re-test pH lies in the buffering range of acetate</w:t>
+                  </w:r>
+                </w:p>
+              </w:tc>
+              <w:tc>
+                <w:tcPr/>
+                <w:p>
+                  <w:pPr>
+                    <w:pStyle w:val="Compact"/>
+                    <w:jc w:val="left"/>
+                    <w:jc w:val="center"/>
+                  </w:pPr>
+                  <w:r>
+                    <w:t xml:space="preserve">a transcription error in Version 1.0 of the report, found in the Version 2.0 review</w:t>
+                  </w:r>
+                </w:p>
+              </w:tc>
+            </w:tr>
           </w:tbl>
           <w:bookmarkEnd w:id="132"/>
           <w:p/>
@@ -25855,9 +25922,38 @@
       </w:r>
     </w:p>
     <w:bookmarkEnd w:id="143"/>
+    <w:bookmarkStart w:id="144" w:name="sec-pd12"/>
+    <w:p>
+      <w:pPr>
+        <w:pStyle w:val="Heading3"/>
+      </w:pPr>
+      <w:r>
+        <w:t xml:space="preserve">13.2.12 PD-007-12 Load/wash buffer named Tris in Version 1.0</w:t>
+      </w:r>
+    </w:p>
+    <w:p>
+      <w:pPr>
+        <w:pStyle w:val="FirstParagraph"/>
+      </w:pPr>
+      <w:r>
+        <w:t xml:space="preserve">Version 1.0 of this report named the load/wash buffer of lot LOT-BUF-2287, used in screening run 6, a Tris buffer (</w:t>
+      </w:r>
+      <w:hyperlink w:anchor="sec-dev01">
+        <w:r>
+          <w:rPr>
+            <w:rStyle w:val="Hyperlink"/>
+          </w:rPr>
+          <w:t xml:space="preserve">Section 13.1.1</w:t>
+        </w:r>
+      </w:hyperlink>
+      <w:r>
+        <w:t xml:space="preserve">). The lot is an acetate load/wash buffer. The name in Version 1.0 was a transcription error, found in the Version 2.0 review. The re-test pH of the lot, 5.02, lies in the buffering range of acetate. The correction changes no result of this report.</w:t>
+      </w:r>
+    </w:p>
     <w:bookmarkEnd w:id="144"/>
     <w:bookmarkEnd w:id="145"/>
-    <w:bookmarkStart w:id="147" w:name="sec-appa"/>
+    <w:bookmarkEnd w:id="146"/>
+    <w:bookmarkStart w:id="148" w:name="sec-appa"/>
     <w:p>
       <w:pPr>
         <w:pStyle w:val="Heading1"/>
@@ -25898,7 +25994,7 @@
       <w:tr>
         <w:tc>
           <w:tcPr/>
-          <w:bookmarkStart w:id="146" w:name="tbl-doe-cex-screening"/>
+          <w:bookmarkStart w:id="147" w:name="tbl-doe-cex-screening"/>
           <w:p>
             <w:pPr>
               <w:jc w:val="center"/>
@@ -28538,7 +28634,7 @@
                     <w:t xml:space="preserve"> </w:t>
                   </w:r>
                   <w:r>
-                    <w:t xml:space="preserve">DEV-007-01: Expired Tris load/wash buffer lot used in screening run 6. Run retained.</w:t>
+                    <w:t xml:space="preserve">DEV-007-01: Expired acetate load/wash buffer lot used in screening run 6. Run retained.</w:t>
                   </w:r>
                 </w:p>
               </w:tc>
@@ -28576,13 +28672,13 @@
               </w:tc>
             </w:tr>
           </w:tbl>
-          <w:bookmarkEnd w:id="146"/>
+          <w:bookmarkEnd w:id="147"/>
           <w:p/>
         </w:tc>
       </w:tr>
     </w:tbl>
-    <w:bookmarkEnd w:id="147"/>
-    <w:bookmarkStart w:id="150" w:name="sec-appb"/>
+    <w:bookmarkEnd w:id="148"/>
+    <w:bookmarkStart w:id="151" w:name="sec-appb"/>
     <w:p>
       <w:pPr>
         <w:pStyle w:val="Heading1"/>
@@ -28640,7 +28736,7 @@
       <w:tr>
         <w:tc>
           <w:tcPr/>
-          <w:bookmarkStart w:id="148" w:name="tbl-doe-cex-rsm"/>
+          <w:bookmarkStart w:id="149" w:name="tbl-doe-cex-rsm"/>
           <w:p>
             <w:pPr>
               <w:jc w:val="center"/>
@@ -32741,7 +32837,7 @@
               </w:tc>
             </w:tr>
           </w:tbl>
-          <w:bookmarkEnd w:id="148"/>
+          <w:bookmarkEnd w:id="149"/>
           <w:p/>
         </w:tc>
       </w:tr>
@@ -32767,7 +32863,7 @@
       <w:tr>
         <w:tc>
           <w:tcPr/>
-          <w:bookmarkStart w:id="149" w:name="tbl-dna-lpa"/>
+          <w:bookmarkStart w:id="150" w:name="tbl-dna-lpa"/>
           <w:p>
             <w:pPr>
               <w:jc w:val="center"/>
@@ -35347,13 +35443,13 @@
               </w:tc>
             </w:tr>
           </w:tbl>
-          <w:bookmarkEnd w:id="149"/>
+          <w:bookmarkEnd w:id="150"/>
           <w:p/>
         </w:tc>
       </w:tr>
     </w:tbl>
-    <w:bookmarkEnd w:id="150"/>
-    <w:bookmarkStart w:id="153" w:name="sec-appc"/>
+    <w:bookmarkEnd w:id="151"/>
+    <w:bookmarkStart w:id="154" w:name="sec-appc"/>
     <w:p>
       <w:pPr>
         <w:pStyle w:val="Heading1"/>
@@ -35425,7 +35521,7 @@
       <w:tr>
         <w:tc>
           <w:tcPr/>
-          <w:bookmarkStart w:id="151" w:name="tbl-scr-effects"/>
+          <w:bookmarkStart w:id="152" w:name="tbl-scr-effects"/>
           <w:p>
             <w:pPr>
               <w:jc w:val="center"/>
@@ -37699,7 +37795,7 @@
               </w:tc>
             </w:tr>
           </w:tbl>
-          <w:bookmarkEnd w:id="151"/>
+          <w:bookmarkEnd w:id="152"/>
           <w:p/>
         </w:tc>
       </w:tr>
@@ -37725,7 +37821,7 @@
       <w:tr>
         <w:tc>
           <w:tcPr/>
-          <w:bookmarkStart w:id="152" w:name="tbl-yield-coef"/>
+          <w:bookmarkStart w:id="153" w:name="tbl-yield-coef"/>
           <w:p>
             <w:pPr>
               <w:jc w:val="center"/>
@@ -38066,13 +38162,13 @@
               </w:tc>
             </w:tr>
           </w:tbl>
-          <w:bookmarkEnd w:id="152"/>
+          <w:bookmarkEnd w:id="153"/>
           <w:p/>
         </w:tc>
       </w:tr>
     </w:tbl>
-    <w:bookmarkEnd w:id="153"/>
-    <w:bookmarkStart w:id="155" w:name="sec-appd"/>
+    <w:bookmarkEnd w:id="154"/>
+    <w:bookmarkStart w:id="156" w:name="sec-appd"/>
     <w:p>
       <w:pPr>
         <w:pStyle w:val="Heading1"/>
@@ -38113,7 +38209,7 @@
       <w:tr>
         <w:tc>
           <w:tcPr/>
-          <w:bookmarkStart w:id="154" w:name="tbl-methods"/>
+          <w:bookmarkStart w:id="155" w:name="tbl-methods"/>
           <w:p>
             <w:pPr>
               <w:jc w:val="center"/>
@@ -38686,13 +38782,13 @@
               </w:tc>
             </w:tr>
           </w:tbl>
-          <w:bookmarkEnd w:id="154"/>
+          <w:bookmarkEnd w:id="155"/>
           <w:p/>
         </w:tc>
       </w:tr>
     </w:tbl>
-    <w:bookmarkEnd w:id="155"/>
-    <w:bookmarkStart w:id="168" w:name="references"/>
+    <w:bookmarkEnd w:id="156"/>
+    <w:bookmarkStart w:id="169" w:name="references"/>
     <w:p>
       <w:pPr>
         <w:pStyle w:val="Heading1"/>
@@ -38701,8 +38797,8 @@
         <w:t xml:space="preserve">References</w:t>
       </w:r>
     </w:p>
-    <w:bookmarkStart w:id="167" w:name="refs"/>
-    <w:bookmarkStart w:id="156" w:name="ref-boxcox1964"/>
+    <w:bookmarkStart w:id="168" w:name="refs"/>
+    <w:bookmarkStart w:id="157" w:name="ref-boxcox1964"/>
     <w:p>
       <w:pPr>
         <w:pStyle w:val="Bibliography"/>
@@ -38733,8 +38829,8 @@
         <w:t xml:space="preserve">26 (2): 211–52.</w:t>
       </w:r>
     </w:p>
-    <w:bookmarkEnd w:id="156"/>
-    <w:bookmarkStart w:id="157" w:name="ref-burnham2002"/>
+    <w:bookmarkEnd w:id="157"/>
+    <w:bookmarkStart w:id="158" w:name="ref-burnham2002"/>
     <w:p>
       <w:pPr>
         <w:pStyle w:val="Bibliography"/>
@@ -38756,8 +38852,8 @@
         <w:t xml:space="preserve">. 2nd ed. New York: Springer.</w:t>
       </w:r>
     </w:p>
-    <w:bookmarkEnd w:id="157"/>
-    <w:bookmarkStart w:id="158" w:name="ref-amab2009"/>
+    <w:bookmarkEnd w:id="158"/>
+    <w:bookmarkStart w:id="159" w:name="ref-amab2009"/>
     <w:p>
       <w:pPr>
         <w:pStyle w:val="Bibliography"/>
@@ -38778,8 +38874,8 @@
         <w:t xml:space="preserve">CASSS.</w:t>
       </w:r>
     </w:p>
-    <w:bookmarkEnd w:id="158"/>
-    <w:bookmarkStart w:id="159" w:name="ref-hurvich1989"/>
+    <w:bookmarkEnd w:id="159"/>
+    <w:bookmarkStart w:id="160" w:name="ref-hurvich1989"/>
     <w:p>
       <w:pPr>
         <w:pStyle w:val="Bibliography"/>
@@ -38810,8 +38906,8 @@
         <w:t xml:space="preserve">76 (2): 297–307.</w:t>
       </w:r>
     </w:p>
-    <w:bookmarkEnd w:id="159"/>
-    <w:bookmarkStart w:id="160" w:name="ref-ichq10"/>
+    <w:bookmarkEnd w:id="160"/>
+    <w:bookmarkStart w:id="161" w:name="ref-ichq10"/>
     <w:p>
       <w:pPr>
         <w:pStyle w:val="Bibliography"/>
@@ -38832,8 +38928,8 @@
         <w:t xml:space="preserve">ICH.</w:t>
       </w:r>
     </w:p>
-    <w:bookmarkEnd w:id="160"/>
-    <w:bookmarkStart w:id="161" w:name="ref-ichq8"/>
+    <w:bookmarkEnd w:id="161"/>
+    <w:bookmarkStart w:id="162" w:name="ref-ichq8"/>
     <w:p>
       <w:pPr>
         <w:pStyle w:val="Bibliography"/>
@@ -38854,8 +38950,8 @@
         <w:t xml:space="preserve">ICH.</w:t>
       </w:r>
     </w:p>
-    <w:bookmarkEnd w:id="161"/>
-    <w:bookmarkStart w:id="162" w:name="ref-ichq11"/>
+    <w:bookmarkEnd w:id="162"/>
+    <w:bookmarkStart w:id="163" w:name="ref-ichq11"/>
     <w:p>
       <w:pPr>
         <w:pStyle w:val="Bibliography"/>
@@ -38876,8 +38972,8 @@
         <w:t xml:space="preserve">ICH.</w:t>
       </w:r>
     </w:p>
-    <w:bookmarkEnd w:id="162"/>
-    <w:bookmarkStart w:id="163" w:name="ref-ichq5a"/>
+    <w:bookmarkEnd w:id="163"/>
+    <w:bookmarkStart w:id="164" w:name="ref-ichq5a"/>
     <w:p>
       <w:pPr>
         <w:pStyle w:val="Bibliography"/>
@@ -38898,8 +38994,8 @@
         <w:t xml:space="preserve">ICH.</w:t>
       </w:r>
     </w:p>
-    <w:bookmarkEnd w:id="163"/>
-    <w:bookmarkStart w:id="164" w:name="ref-ichq9"/>
+    <w:bookmarkEnd w:id="164"/>
+    <w:bookmarkStart w:id="165" w:name="ref-ichq9"/>
     <w:p>
       <w:pPr>
         <w:pStyle w:val="Bibliography"/>
@@ -38920,8 +39016,8 @@
         <w:t xml:space="preserve">ICH.</w:t>
       </w:r>
     </w:p>
-    <w:bookmarkEnd w:id="164"/>
-    <w:bookmarkStart w:id="165" w:name="ref-montgomery2017"/>
+    <w:bookmarkEnd w:id="165"/>
+    <w:bookmarkStart w:id="166" w:name="ref-montgomery2017"/>
     <w:p>
       <w:pPr>
         <w:pStyle w:val="Bibliography"/>
@@ -38943,8 +39039,8 @@
         <w:t xml:space="preserve">. 9th ed. Hoboken, NJ: Wiley.</w:t>
       </w:r>
     </w:p>
-    <w:bookmarkEnd w:id="165"/>
-    <w:bookmarkStart w:id="166" w:name="ref-fda2011"/>
+    <w:bookmarkEnd w:id="166"/>
+    <w:bookmarkStart w:id="167" w:name="ref-fda2011"/>
     <w:p>
       <w:pPr>
         <w:pStyle w:val="Bibliography"/>
@@ -38965,9 +39061,9 @@
         <w:t xml:space="preserve">FDA.</w:t>
       </w:r>
     </w:p>
-    <w:bookmarkEnd w:id="166"/>
     <w:bookmarkEnd w:id="167"/>
     <w:bookmarkEnd w:id="168"/>
+    <w:bookmarkEnd w:id="169"/>
     <w:sectPr>
       <w:footnotePr>
         <w:numRestart w:val="eachSect"/>

</xml_diff>